<commit_message>
Rebuild proposal video from user-edited deck with smoother narration
17-slide video (6:16) rendered from the user's revised deck; narration
resynthesized at natural announcer pace with sentence-level pauses and
loudness normalization. Narration script docx updated to 17 slides with
new timings; user's deck revision stored as the current proposal.

Co-Authored-By: Claude Fable 5 <noreply@anthropic.com>
Claude-Session: https://claude.ai/code/session_01FbQP7AjAZoRwNRDcTdAboQ
</commit_message>
<xml_diff>
--- a/docs/presentations/Taesungdang_Narration_Script.docx
+++ b/docs/presentations/Taesungdang_Narration_Script.docx
@@ -99,22 +99,22 @@
           <w:sz w:val="18"/>
           <w:szCs w:val="18"/>
         </w:rPr>
-        <w:t xml:space="preserve">영상 시작 0:00 · 약 24.4초</w:t>
-      </w:r>
-    </w:p>
-    <w:p>
-      <w:pPr>
-        <w:shd w:fill="F8F2EA" w:val="clear"/>
-        <w:spacing w:after="160" w:line="330"/>
-      </w:pPr>
-      <w:r>
-        <w:rPr>
-          <w:rFonts w:ascii="Malgun Gothic" w:cs="Malgun Gothic" w:eastAsia="Malgun Gothic" w:hAnsi="Malgun Gothic"/>
-          <w:color w:val="2B1D12"/>
-          <w:sz w:val="22"/>
-          <w:szCs w:val="22"/>
-        </w:rPr>
-        <w:t xml:space="preserve">안녕하십니까, 에이에스씨입니다. 주식회사 태성당의 질의에 답하는 에이엑스 프로젝트 제안 영상입니다. 원자재와 완제품 재고 관리, 매장과 비투비 발주, 회계 연동, 그리고 에이아이 실무 자동화까지. 결론부터 말씀드리면, 맞춤 현장 컨설팅, 가능합니다. 지금부터 그 실행 설계도를 육 분 동안 보여드리겠습니다.</w:t>
+        <w:t xml:space="preserve">영상 시작 0:00 · 약 23.8초</w:t>
+      </w:r>
+    </w:p>
+    <w:p>
+      <w:pPr>
+        <w:shd w:fill="F8F2EA" w:val="clear"/>
+        <w:spacing w:after="160" w:line="330"/>
+      </w:pPr>
+      <w:r>
+        <w:rPr>
+          <w:rFonts w:ascii="Malgun Gothic" w:cs="Malgun Gothic" w:eastAsia="Malgun Gothic" w:hAnsi="Malgun Gothic"/>
+          <w:color w:val="2B1D12"/>
+          <w:sz w:val="22"/>
+          <w:szCs w:val="22"/>
+        </w:rPr>
+        <w:t xml:space="preserve">안녕하십니까, 에이에스씨입니다. 주식회사 태성당의 질의에 답하는 에이엑스 프로젝트 제안 영상입니다. 원자재와 완제품 재고 관리, 매장과 비투비 발주, 회계 연동, 그리고 에이아이 실무 자동화까지. 결론부터 말씀드리면, 맞춤 현장 컨설팅, 가능합니다. 지금부터 그 실행 설계도를 함께 보시겠습니다.</w:t>
       </w:r>
     </w:p>
     <w:p>
@@ -146,7 +146,7 @@
           <w:sz w:val="18"/>
           <w:szCs w:val="18"/>
         </w:rPr>
-        <w:t xml:space="preserve">영상 시작 0:24 · 약 22.5초</w:t>
+        <w:t xml:space="preserve">영상 시작 0:23 · 약 21.7초</w:t>
       </w:r>
     </w:p>
     <w:p>
@@ -193,7 +193,7 @@
           <w:sz w:val="18"/>
           <w:szCs w:val="18"/>
         </w:rPr>
-        <w:t xml:space="preserve">영상 시작 0:46 · 약 22.1초</w:t>
+        <w:t xml:space="preserve">영상 시작 0:45 · 약 22.7초</w:t>
       </w:r>
     </w:p>
     <w:p>
@@ -224,23 +224,70 @@
           <w:sz w:val="24"/>
           <w:szCs w:val="24"/>
         </w:rPr>
-        <w:t xml:space="preserve">04. To-Be 총괄 아키텍처 — 트랜잭션에서 에이전트까지</w:t>
-      </w:r>
-    </w:p>
-    <w:p>
-      <w:pPr>
-        <w:spacing w:after="100"/>
-      </w:pPr>
-      <w:r>
-        <w:rPr>
-          <w:rFonts w:ascii="Malgun Gothic" w:cs="Malgun Gothic" w:eastAsia="Malgun Gothic" w:hAnsi="Malgun Gothic"/>
-          <w:b/>
-          <w:bCs/>
-          <w:color w:val="C07F1E"/>
-          <w:sz w:val="18"/>
-          <w:szCs w:val="18"/>
-        </w:rPr>
-        <w:t xml:space="preserve">영상 시작 1:09 · 약 24.5초</w:t>
+        <w:t xml:space="preserve">04. 벤치마크 — 대전 성심당 (신규)</w:t>
+      </w:r>
+    </w:p>
+    <w:p>
+      <w:pPr>
+        <w:spacing w:after="100"/>
+      </w:pPr>
+      <w:r>
+        <w:rPr>
+          <w:rFonts w:ascii="Malgun Gothic" w:cs="Malgun Gothic" w:eastAsia="Malgun Gothic" w:hAnsi="Malgun Gothic"/>
+          <w:b/>
+          <w:bCs/>
+          <w:color w:val="C07F1E"/>
+          <w:sz w:val="18"/>
+          <w:szCs w:val="18"/>
+        </w:rPr>
+        <w:t xml:space="preserve">영상 시작 1:08 · 약 22.5초</w:t>
+      </w:r>
+    </w:p>
+    <w:p>
+      <w:pPr>
+        <w:shd w:fill="F8F2EA" w:val="clear"/>
+        <w:spacing w:after="160" w:line="330"/>
+      </w:pPr>
+      <w:r>
+        <w:rPr>
+          <w:rFonts w:ascii="Malgun Gothic" w:cs="Malgun Gothic" w:eastAsia="Malgun Gothic" w:hAnsi="Malgun Gothic"/>
+          <w:color w:val="2B1D12"/>
+          <w:sz w:val="22"/>
+          <w:szCs w:val="22"/>
+        </w:rPr>
+        <w:t xml:space="preserve">우리나라 베이커리의 정점, 대전 성심당을 벤치마킹했습니다. 매장 단 네 곳으로 이천육백억 원의 매출과 이십오 퍼센트의 이익률을 내는 비결은, 당일 소진과 로스 규율이라는 운영 원리입니다. 성심당이 철학과 육십팔 년의 세월로 이룬 규율을, 태성당은 데이터와 에이아이로 압축해 추격합니다.</w:t>
+      </w:r>
+    </w:p>
+    <w:p>
+      <w:pPr>
+        <w:spacing w:after="80" w:before="300"/>
+      </w:pPr>
+      <w:r>
+        <w:rPr>
+          <w:rFonts w:ascii="Malgun Gothic" w:cs="Malgun Gothic" w:eastAsia="Malgun Gothic" w:hAnsi="Malgun Gothic"/>
+          <w:b/>
+          <w:bCs/>
+          <w:color w:val="9C5227"/>
+          <w:sz w:val="24"/>
+          <w:szCs w:val="24"/>
+        </w:rPr>
+        <w:t xml:space="preserve">05. To-Be 총괄 아키텍처 — 트랜잭션에서 에이전트까지</w:t>
+      </w:r>
+    </w:p>
+    <w:p>
+      <w:pPr>
+        <w:spacing w:after="100"/>
+      </w:pPr>
+      <w:r>
+        <w:rPr>
+          <w:rFonts w:ascii="Malgun Gothic" w:cs="Malgun Gothic" w:eastAsia="Malgun Gothic" w:hAnsi="Malgun Gothic"/>
+          <w:b/>
+          <w:bCs/>
+          <w:color w:val="C07F1E"/>
+          <w:sz w:val="18"/>
+          <w:szCs w:val="18"/>
+        </w:rPr>
+        <w:t xml:space="preserve">영상 시작 1:30 · 약 23.3초</w:t>
       </w:r>
     </w:p>
     <w:p>
@@ -271,23 +318,23 @@
           <w:sz w:val="24"/>
           <w:szCs w:val="24"/>
         </w:rPr>
-        <w:t xml:space="preserve">05. 원자재 재고 — 로트·유통기한·역산 발주</w:t>
-      </w:r>
-    </w:p>
-    <w:p>
-      <w:pPr>
-        <w:spacing w:after="100"/>
-      </w:pPr>
-      <w:r>
-        <w:rPr>
-          <w:rFonts w:ascii="Malgun Gothic" w:cs="Malgun Gothic" w:eastAsia="Malgun Gothic" w:hAnsi="Malgun Gothic"/>
-          <w:b/>
-          <w:bCs/>
-          <w:color w:val="C07F1E"/>
-          <w:sz w:val="18"/>
-          <w:szCs w:val="18"/>
-        </w:rPr>
-        <w:t xml:space="preserve">영상 시작 1:33 · 약 23초</w:t>
+        <w:t xml:space="preserve">06. 원자재 재고 — 로트·유통기한·역산 발주</w:t>
+      </w:r>
+    </w:p>
+    <w:p>
+      <w:pPr>
+        <w:spacing w:after="100"/>
+      </w:pPr>
+      <w:r>
+        <w:rPr>
+          <w:rFonts w:ascii="Malgun Gothic" w:cs="Malgun Gothic" w:eastAsia="Malgun Gothic" w:hAnsi="Malgun Gothic"/>
+          <w:b/>
+          <w:bCs/>
+          <w:color w:val="C07F1E"/>
+          <w:sz w:val="18"/>
+          <w:szCs w:val="18"/>
+        </w:rPr>
+        <w:t xml:space="preserve">영상 시작 1:53 · 약 23초</w:t>
       </w:r>
     </w:p>
     <w:p>
@@ -318,23 +365,23 @@
           <w:sz w:val="24"/>
           <w:szCs w:val="24"/>
         </w:rPr>
-        <w:t xml:space="preserve">06. 완제품 재고 — 신선빵과 선물세트, 다지점 가용재고</w:t>
-      </w:r>
-    </w:p>
-    <w:p>
-      <w:pPr>
-        <w:spacing w:after="100"/>
-      </w:pPr>
-      <w:r>
-        <w:rPr>
-          <w:rFonts w:ascii="Malgun Gothic" w:cs="Malgun Gothic" w:eastAsia="Malgun Gothic" w:hAnsi="Malgun Gothic"/>
-          <w:b/>
-          <w:bCs/>
-          <w:color w:val="C07F1E"/>
-          <w:sz w:val="18"/>
-          <w:szCs w:val="18"/>
-        </w:rPr>
-        <w:t xml:space="preserve">영상 시작 1:56 · 약 23.5초</w:t>
+        <w:t xml:space="preserve">07. 완제품 재고 — 신선빵과 선물세트, 다지점 가용재고</w:t>
+      </w:r>
+    </w:p>
+    <w:p>
+      <w:pPr>
+        <w:spacing w:after="100"/>
+      </w:pPr>
+      <w:r>
+        <w:rPr>
+          <w:rFonts w:ascii="Malgun Gothic" w:cs="Malgun Gothic" w:eastAsia="Malgun Gothic" w:hAnsi="Malgun Gothic"/>
+          <w:b/>
+          <w:bCs/>
+          <w:color w:val="C07F1E"/>
+          <w:sz w:val="18"/>
+          <w:szCs w:val="18"/>
+        </w:rPr>
+        <w:t xml:space="preserve">영상 시작 2:17 · 약 23.3초</w:t>
       </w:r>
     </w:p>
     <w:p>
@@ -365,23 +412,23 @@
           <w:sz w:val="24"/>
           <w:szCs w:val="24"/>
         </w:rPr>
-        <w:t xml:space="preserve">07. 매장/B2B 발주와 회계 연동 (O2C)</w:t>
-      </w:r>
-    </w:p>
-    <w:p>
-      <w:pPr>
-        <w:spacing w:after="100"/>
-      </w:pPr>
-      <w:r>
-        <w:rPr>
-          <w:rFonts w:ascii="Malgun Gothic" w:cs="Malgun Gothic" w:eastAsia="Malgun Gothic" w:hAnsi="Malgun Gothic"/>
-          <w:b/>
-          <w:bCs/>
-          <w:color w:val="C07F1E"/>
-          <w:sz w:val="18"/>
-          <w:szCs w:val="18"/>
-        </w:rPr>
-        <w:t xml:space="preserve">영상 시작 2:20 · 약 23.6초</w:t>
+        <w:t xml:space="preserve">08. 매장/B2B 발주와 회계 연동 (O2C)</w:t>
+      </w:r>
+    </w:p>
+    <w:p>
+      <w:pPr>
+        <w:spacing w:after="100"/>
+      </w:pPr>
+      <w:r>
+        <w:rPr>
+          <w:rFonts w:ascii="Malgun Gothic" w:cs="Malgun Gothic" w:eastAsia="Malgun Gothic" w:hAnsi="Malgun Gothic"/>
+          <w:b/>
+          <w:bCs/>
+          <w:color w:val="C07F1E"/>
+          <w:sz w:val="18"/>
+          <w:szCs w:val="18"/>
+        </w:rPr>
+        <w:t xml:space="preserve">영상 시작 2:40 · 약 21.9초</w:t>
       </w:r>
     </w:p>
     <w:p>
@@ -412,23 +459,23 @@
           <w:sz w:val="24"/>
           <w:szCs w:val="24"/>
         </w:rPr>
-        <w:t xml:space="preserve">08. AI 프로젝트 1 — 수요예측</w:t>
-      </w:r>
-    </w:p>
-    <w:p>
-      <w:pPr>
-        <w:spacing w:after="100"/>
-      </w:pPr>
-      <w:r>
-        <w:rPr>
-          <w:rFonts w:ascii="Malgun Gothic" w:cs="Malgun Gothic" w:eastAsia="Malgun Gothic" w:hAnsi="Malgun Gothic"/>
-          <w:b/>
-          <w:bCs/>
-          <w:color w:val="C07F1E"/>
-          <w:sz w:val="18"/>
-          <w:szCs w:val="18"/>
-        </w:rPr>
-        <w:t xml:space="preserve">영상 시작 2:43 · 약 21.6초</w:t>
+        <w:t xml:space="preserve">09. AI 프로젝트 1 — 수요예측</w:t>
+      </w:r>
+    </w:p>
+    <w:p>
+      <w:pPr>
+        <w:spacing w:after="100"/>
+      </w:pPr>
+      <w:r>
+        <w:rPr>
+          <w:rFonts w:ascii="Malgun Gothic" w:cs="Malgun Gothic" w:eastAsia="Malgun Gothic" w:hAnsi="Malgun Gothic"/>
+          <w:b/>
+          <w:bCs/>
+          <w:color w:val="C07F1E"/>
+          <w:sz w:val="18"/>
+          <w:szCs w:val="18"/>
+        </w:rPr>
+        <w:t xml:space="preserve">영상 시작 3:02 · 약 21.5초</w:t>
       </w:r>
     </w:p>
     <w:p>
@@ -459,23 +506,23 @@
           <w:sz w:val="24"/>
           <w:szCs w:val="24"/>
         </w:rPr>
-        <w:t xml:space="preserve">09. AI 프로젝트 2 — 영업 자동화</w:t>
-      </w:r>
-    </w:p>
-    <w:p>
-      <w:pPr>
-        <w:spacing w:after="100"/>
-      </w:pPr>
-      <w:r>
-        <w:rPr>
-          <w:rFonts w:ascii="Malgun Gothic" w:cs="Malgun Gothic" w:eastAsia="Malgun Gothic" w:hAnsi="Malgun Gothic"/>
-          <w:b/>
-          <w:bCs/>
-          <w:color w:val="C07F1E"/>
-          <w:sz w:val="18"/>
-          <w:szCs w:val="18"/>
-        </w:rPr>
-        <w:t xml:space="preserve">영상 시작 3:05 · 약 22초</w:t>
+        <w:t xml:space="preserve">10. AI 프로젝트 2 — 영업 자동화</w:t>
+      </w:r>
+    </w:p>
+    <w:p>
+      <w:pPr>
+        <w:spacing w:after="100"/>
+      </w:pPr>
+      <w:r>
+        <w:rPr>
+          <w:rFonts w:ascii="Malgun Gothic" w:cs="Malgun Gothic" w:eastAsia="Malgun Gothic" w:hAnsi="Malgun Gothic"/>
+          <w:b/>
+          <w:bCs/>
+          <w:color w:val="C07F1E"/>
+          <w:sz w:val="18"/>
+          <w:szCs w:val="18"/>
+        </w:rPr>
+        <w:t xml:space="preserve">영상 시작 3:23 · 약 20.9초</w:t>
       </w:r>
     </w:p>
     <w:p>
@@ -506,23 +553,23 @@
           <w:sz w:val="24"/>
           <w:szCs w:val="24"/>
         </w:rPr>
-        <w:t xml:space="preserve">10. AI 프로젝트 3 — 재고 최적화</w:t>
-      </w:r>
-    </w:p>
-    <w:p>
-      <w:pPr>
-        <w:spacing w:after="100"/>
-      </w:pPr>
-      <w:r>
-        <w:rPr>
-          <w:rFonts w:ascii="Malgun Gothic" w:cs="Malgun Gothic" w:eastAsia="Malgun Gothic" w:hAnsi="Malgun Gothic"/>
-          <w:b/>
-          <w:bCs/>
-          <w:color w:val="C07F1E"/>
-          <w:sz w:val="18"/>
-          <w:szCs w:val="18"/>
-        </w:rPr>
-        <w:t xml:space="preserve">영상 시작 3:27 · 약 21.9초</w:t>
+        <w:t xml:space="preserve">11. AI 프로젝트 3 — 재고 최적화</w:t>
+      </w:r>
+    </w:p>
+    <w:p>
+      <w:pPr>
+        <w:spacing w:after="100"/>
+      </w:pPr>
+      <w:r>
+        <w:rPr>
+          <w:rFonts w:ascii="Malgun Gothic" w:cs="Malgun Gothic" w:eastAsia="Malgun Gothic" w:hAnsi="Malgun Gothic"/>
+          <w:b/>
+          <w:bCs/>
+          <w:color w:val="C07F1E"/>
+          <w:sz w:val="18"/>
+          <w:szCs w:val="18"/>
+        </w:rPr>
+        <w:t xml:space="preserve">영상 시작 3:44 · 약 21.9초</w:t>
       </w:r>
     </w:p>
     <w:p>
@@ -553,23 +600,23 @@
           <w:sz w:val="24"/>
           <w:szCs w:val="24"/>
         </w:rPr>
-        <w:t xml:space="preserve">11. 데이터 트랜잭션 파이프라인</w:t>
-      </w:r>
-    </w:p>
-    <w:p>
-      <w:pPr>
-        <w:spacing w:after="100"/>
-      </w:pPr>
-      <w:r>
-        <w:rPr>
-          <w:rFonts w:ascii="Malgun Gothic" w:cs="Malgun Gothic" w:eastAsia="Malgun Gothic" w:hAnsi="Malgun Gothic"/>
-          <w:b/>
-          <w:bCs/>
-          <w:color w:val="C07F1E"/>
-          <w:sz w:val="18"/>
-          <w:szCs w:val="18"/>
-        </w:rPr>
-        <w:t xml:space="preserve">영상 시작 3:48 · 약 21.9초</w:t>
+        <w:t xml:space="preserve">12. 데이터 트랜잭션 파이프라인</w:t>
+      </w:r>
+    </w:p>
+    <w:p>
+      <w:pPr>
+        <w:spacing w:after="100"/>
+      </w:pPr>
+      <w:r>
+        <w:rPr>
+          <w:rFonts w:ascii="Malgun Gothic" w:cs="Malgun Gothic" w:eastAsia="Malgun Gothic" w:hAnsi="Malgun Gothic"/>
+          <w:b/>
+          <w:bCs/>
+          <w:color w:val="C07F1E"/>
+          <w:sz w:val="18"/>
+          <w:szCs w:val="18"/>
+        </w:rPr>
+        <w:t xml:space="preserve">영상 시작 4:06 · 약 21.9초</w:t>
       </w:r>
     </w:p>
     <w:p>
@@ -600,23 +647,23 @@
           <w:sz w:val="24"/>
           <w:szCs w:val="24"/>
         </w:rPr>
-        <w:t xml:space="preserve">12. 온톨로지·지식그래프</w:t>
-      </w:r>
-    </w:p>
-    <w:p>
-      <w:pPr>
-        <w:spacing w:after="100"/>
-      </w:pPr>
-      <w:r>
-        <w:rPr>
-          <w:rFonts w:ascii="Malgun Gothic" w:cs="Malgun Gothic" w:eastAsia="Malgun Gothic" w:hAnsi="Malgun Gothic"/>
-          <w:b/>
-          <w:bCs/>
-          <w:color w:val="C07F1E"/>
-          <w:sz w:val="18"/>
-          <w:szCs w:val="18"/>
-        </w:rPr>
-        <w:t xml:space="preserve">영상 시작 4:10 · 약 20.8초</w:t>
+        <w:t xml:space="preserve">13. 온톨로지·지식그래프</w:t>
+      </w:r>
+    </w:p>
+    <w:p>
+      <w:pPr>
+        <w:spacing w:after="100"/>
+      </w:pPr>
+      <w:r>
+        <w:rPr>
+          <w:rFonts w:ascii="Malgun Gothic" w:cs="Malgun Gothic" w:eastAsia="Malgun Gothic" w:hAnsi="Malgun Gothic"/>
+          <w:b/>
+          <w:bCs/>
+          <w:color w:val="C07F1E"/>
+          <w:sz w:val="18"/>
+          <w:szCs w:val="18"/>
+        </w:rPr>
+        <w:t xml:space="preserve">영상 시작 4:28 · 약 20.3초</w:t>
       </w:r>
     </w:p>
     <w:p>
@@ -647,23 +694,23 @@
           <w:sz w:val="24"/>
           <w:szCs w:val="24"/>
         </w:rPr>
-        <w:t xml:space="preserve">13. AI 에이전트 포트폴리오와 War Room</w:t>
-      </w:r>
-    </w:p>
-    <w:p>
-      <w:pPr>
-        <w:spacing w:after="100"/>
-      </w:pPr>
-      <w:r>
-        <w:rPr>
-          <w:rFonts w:ascii="Malgun Gothic" w:cs="Malgun Gothic" w:eastAsia="Malgun Gothic" w:hAnsi="Malgun Gothic"/>
-          <w:b/>
-          <w:bCs/>
-          <w:color w:val="C07F1E"/>
-          <w:sz w:val="18"/>
-          <w:szCs w:val="18"/>
-        </w:rPr>
-        <w:t xml:space="preserve">영상 시작 4:31 · 약 21.5초</w:t>
+        <w:t xml:space="preserve">14. AI 에이전트 포트폴리오와 War Room</w:t>
+      </w:r>
+    </w:p>
+    <w:p>
+      <w:pPr>
+        <w:spacing w:after="100"/>
+      </w:pPr>
+      <w:r>
+        <w:rPr>
+          <w:rFonts w:ascii="Malgun Gothic" w:cs="Malgun Gothic" w:eastAsia="Malgun Gothic" w:hAnsi="Malgun Gothic"/>
+          <w:b/>
+          <w:bCs/>
+          <w:color w:val="C07F1E"/>
+          <w:sz w:val="18"/>
+          <w:szCs w:val="18"/>
+        </w:rPr>
+        <w:t xml:space="preserve">영상 시작 4:48 · 약 21.7초</w:t>
       </w:r>
     </w:p>
     <w:p>
@@ -694,23 +741,23 @@
           <w:sz w:val="24"/>
           <w:szCs w:val="24"/>
         </w:rPr>
-        <w:t xml:space="preserve">14. 추진 로드맵 — 5단계</w:t>
-      </w:r>
-    </w:p>
-    <w:p>
-      <w:pPr>
-        <w:spacing w:after="100"/>
-      </w:pPr>
-      <w:r>
-        <w:rPr>
-          <w:rFonts w:ascii="Malgun Gothic" w:cs="Malgun Gothic" w:eastAsia="Malgun Gothic" w:hAnsi="Malgun Gothic"/>
-          <w:b/>
-          <w:bCs/>
-          <w:color w:val="C07F1E"/>
-          <w:sz w:val="18"/>
-          <w:szCs w:val="18"/>
-        </w:rPr>
-        <w:t xml:space="preserve">영상 시작 4:53 · 약 23.8초</w:t>
+        <w:t xml:space="preserve">15. 추진 로드맵 — 5단계</w:t>
+      </w:r>
+    </w:p>
+    <w:p>
+      <w:pPr>
+        <w:spacing w:after="100"/>
+      </w:pPr>
+      <w:r>
+        <w:rPr>
+          <w:rFonts w:ascii="Malgun Gothic" w:cs="Malgun Gothic" w:eastAsia="Malgun Gothic" w:hAnsi="Malgun Gothic"/>
+          <w:b/>
+          <w:bCs/>
+          <w:color w:val="C07F1E"/>
+          <w:sz w:val="18"/>
+          <w:szCs w:val="18"/>
+        </w:rPr>
+        <w:t xml:space="preserve">영상 시작 5:10 · 약 23.6초</w:t>
       </w:r>
     </w:p>
     <w:p>
@@ -741,23 +788,23 @@
           <w:sz w:val="24"/>
           <w:szCs w:val="24"/>
         </w:rPr>
-        <w:t xml:space="preserve">15. 판정 KPI와 기대효과</w:t>
-      </w:r>
-    </w:p>
-    <w:p>
-      <w:pPr>
-        <w:spacing w:after="100"/>
-      </w:pPr>
-      <w:r>
-        <w:rPr>
-          <w:rFonts w:ascii="Malgun Gothic" w:cs="Malgun Gothic" w:eastAsia="Malgun Gothic" w:hAnsi="Malgun Gothic"/>
-          <w:b/>
-          <w:bCs/>
-          <w:color w:val="C07F1E"/>
-          <w:sz w:val="18"/>
-          <w:szCs w:val="18"/>
-        </w:rPr>
-        <w:t xml:space="preserve">영상 시작 5:17 · 약 21.3초</w:t>
+        <w:t xml:space="preserve">16. 판정 KPI와 기대효과</w:t>
+      </w:r>
+    </w:p>
+    <w:p>
+      <w:pPr>
+        <w:spacing w:after="100"/>
+      </w:pPr>
+      <w:r>
+        <w:rPr>
+          <w:rFonts w:ascii="Malgun Gothic" w:cs="Malgun Gothic" w:eastAsia="Malgun Gothic" w:hAnsi="Malgun Gothic"/>
+          <w:b/>
+          <w:bCs/>
+          <w:color w:val="C07F1E"/>
+          <w:sz w:val="18"/>
+          <w:szCs w:val="18"/>
+        </w:rPr>
+        <w:t xml:space="preserve">영상 시작 5:34 · 약 20.9초</w:t>
       </w:r>
     </w:p>
     <w:p>
@@ -788,23 +835,23 @@
           <w:sz w:val="24"/>
           <w:szCs w:val="24"/>
         </w:rPr>
-        <w:t xml:space="preserve">16. 맺음 — 네, 가능합니다</w:t>
-      </w:r>
-    </w:p>
-    <w:p>
-      <w:pPr>
-        <w:spacing w:after="100"/>
-      </w:pPr>
-      <w:r>
-        <w:rPr>
-          <w:rFonts w:ascii="Malgun Gothic" w:cs="Malgun Gothic" w:eastAsia="Malgun Gothic" w:hAnsi="Malgun Gothic"/>
-          <w:b/>
-          <w:bCs/>
-          <w:color w:val="C07F1E"/>
-          <w:sz w:val="18"/>
-          <w:szCs w:val="18"/>
-        </w:rPr>
-        <w:t xml:space="preserve">영상 시작 5:38 · 약 20.5초</w:t>
+        <w:t xml:space="preserve">17. 맺음 — 네, 가능합니다</w:t>
+      </w:r>
+    </w:p>
+    <w:p>
+      <w:pPr>
+        <w:spacing w:after="100"/>
+      </w:pPr>
+      <w:r>
+        <w:rPr>
+          <w:rFonts w:ascii="Malgun Gothic" w:cs="Malgun Gothic" w:eastAsia="Malgun Gothic" w:hAnsi="Malgun Gothic"/>
+          <w:b/>
+          <w:bCs/>
+          <w:color w:val="C07F1E"/>
+          <w:sz w:val="18"/>
+          <w:szCs w:val="18"/>
+        </w:rPr>
+        <w:t xml:space="preserve">영상 시작 5:54 · 약 21.8초</w:t>
       </w:r>
     </w:p>
     <w:p>

</xml_diff>

<commit_message>
Update closing quote on slide 17 and rebuild video/script
Replace '1st Brain/two brains' phrasing with the requested wording
(Taesungdang, Odoo ERP, intelligent ERP); resynthesize slide 17
narration and reassemble the video (6:21); notes and script updated.

Co-Authored-By: Claude Fable 5 <noreply@anthropic.com>
Claude-Session: https://claude.ai/code/session_01FbQP7AjAZoRwNRDcTdAboQ
</commit_message>
<xml_diff>
--- a/docs/presentations/Taesungdang_Narration_Script.docx
+++ b/docs/presentations/Taesungdang_Narration_Script.docx
@@ -851,22 +851,22 @@
           <w:sz w:val="18"/>
           <w:szCs w:val="18"/>
         </w:rPr>
-        <w:t xml:space="preserve">영상 시작 5:54 · 약 21.8초</w:t>
-      </w:r>
-    </w:p>
-    <w:p>
-      <w:pPr>
-        <w:shd w:fill="F8F2EA" w:val="clear"/>
-        <w:spacing w:after="160" w:line="330"/>
-      </w:pPr>
-      <w:r>
-        <w:rPr>
-          <w:rFonts w:ascii="Malgun Gothic" w:cs="Malgun Gothic" w:eastAsia="Malgun Gothic" w:hAnsi="Malgun Gothic"/>
-          <w:color w:val="2B1D12"/>
-          <w:sz w:val="22"/>
-          <w:szCs w:val="22"/>
-        </w:rPr>
-        <w:t xml:space="preserve">다시 답 드립니다. 네, 가능합니다. 첫걸음은 초량 본점의 무상 현장 진단 워크숍입니다. 칠십 년의 빵 굽는 기술 곁에, 기록하는 두 번째 뇌와 판단하는 세 번째 뇌를 세울 차례입니다. 부산, 영남권 담당 조직이 함께하겠습니다. 감사합니다.</w:t>
+        <w:t xml:space="preserve">영상 시작 5:54 · 약 26초</w:t>
+      </w:r>
+    </w:p>
+    <w:p>
+      <w:pPr>
+        <w:shd w:fill="F8F2EA" w:val="clear"/>
+        <w:spacing w:after="160" w:line="330"/>
+      </w:pPr>
+      <w:r>
+        <w:rPr>
+          <w:rFonts w:ascii="Malgun Gothic" w:cs="Malgun Gothic" w:eastAsia="Malgun Gothic" w:hAnsi="Malgun Gothic"/>
+          <w:color w:val="2B1D12"/>
+          <w:sz w:val="22"/>
+          <w:szCs w:val="22"/>
+        </w:rPr>
+        <w:t xml:space="preserve">다시 답 드립니다. 네, 가능합니다. 첫걸음은 초량 본점의 무상 현장 진단 워크숍입니다. 칠십 년의 빵 굽는 기술이 태성당을 만들었습니다. 이제 그 곁에, 기록하는 두 번째 오두 이알피와, 판단하는 세 번째 지능형 이알피를 세울 차례입니다. 부산, 영남권 담당 조직이 함께하겠습니다. 감사합니다.</w:t>
       </w:r>
     </w:p>
     <w:sectPr>

</xml_diff>